<commit_message>
Changes to Cost estimate
</commit_message>
<xml_diff>
--- a/(BIT301)_Assignment1.docx
+++ b/(BIT301)_Assignment1.docx
@@ -46,7 +46,7 @@
           <w:r>
             <w:fldChar w:fldCharType="separate"/>
           </w:r>
-          <w:hyperlink w:anchor="_Toc234569434" w:history="1">
+          <w:hyperlink w:anchor="_Toc234570435" w:history="1">
             <w:r>
               <w:rPr>
                 <w:rStyle w:val="Hyperlink"/>
@@ -88,7 +88,7 @@
                 <w:noProof/>
                 <w:webHidden/>
               </w:rPr>
-              <w:instrText xml:space="preserve"> PAGEREF _Toc234569434 \h </w:instrText>
+              <w:instrText xml:space="preserve"> PAGEREF _Toc234570435 \h </w:instrText>
             </w:r>
             <w:r>
               <w:rPr>
@@ -132,7 +132,7 @@
               <w:szCs w:val="21"/>
             </w:rPr>
           </w:pPr>
-          <w:hyperlink w:anchor="_Toc234569435" w:history="1">
+          <w:hyperlink w:anchor="_Toc234570436" w:history="1">
             <w:r>
               <w:rPr>
                 <w:rStyle w:val="Hyperlink"/>
@@ -174,7 +174,7 @@
                 <w:noProof/>
                 <w:webHidden/>
               </w:rPr>
-              <w:instrText xml:space="preserve"> PAGEREF _Toc234569435 \h </w:instrText>
+              <w:instrText xml:space="preserve"> PAGEREF _Toc234570436 \h </w:instrText>
             </w:r>
             <w:r>
               <w:rPr>
@@ -218,7 +218,7 @@
               <w:szCs w:val="21"/>
             </w:rPr>
           </w:pPr>
-          <w:hyperlink w:anchor="_Toc234569436" w:history="1">
+          <w:hyperlink w:anchor="_Toc234570437" w:history="1">
             <w:r>
               <w:rPr>
                 <w:rStyle w:val="Hyperlink"/>
@@ -260,7 +260,7 @@
                 <w:noProof/>
                 <w:webHidden/>
               </w:rPr>
-              <w:instrText xml:space="preserve"> PAGEREF _Toc234569436 \h </w:instrText>
+              <w:instrText xml:space="preserve"> PAGEREF _Toc234570437 \h </w:instrText>
             </w:r>
             <w:r>
               <w:rPr>
@@ -304,7 +304,7 @@
               <w:szCs w:val="21"/>
             </w:rPr>
           </w:pPr>
-          <w:hyperlink w:anchor="_Toc234569437" w:history="1">
+          <w:hyperlink w:anchor="_Toc234570438" w:history="1">
             <w:r>
               <w:rPr>
                 <w:rStyle w:val="Hyperlink"/>
@@ -346,7 +346,7 @@
                 <w:noProof/>
                 <w:webHidden/>
               </w:rPr>
-              <w:instrText xml:space="preserve"> PAGEREF _Toc234569437 \h </w:instrText>
+              <w:instrText xml:space="preserve"> PAGEREF _Toc234570438 \h </w:instrText>
             </w:r>
             <w:r>
               <w:rPr>
@@ -390,7 +390,7 @@
               <w:szCs w:val="21"/>
             </w:rPr>
           </w:pPr>
-          <w:hyperlink w:anchor="_Toc234569438" w:history="1">
+          <w:hyperlink w:anchor="_Toc234570439" w:history="1">
             <w:r>
               <w:rPr>
                 <w:rStyle w:val="Hyperlink"/>
@@ -432,7 +432,7 @@
                 <w:noProof/>
                 <w:webHidden/>
               </w:rPr>
-              <w:instrText xml:space="preserve"> PAGEREF _Toc234569438 \h </w:instrText>
+              <w:instrText xml:space="preserve"> PAGEREF _Toc234570439 \h </w:instrText>
             </w:r>
             <w:r>
               <w:rPr>
@@ -476,7 +476,7 @@
               <w:szCs w:val="21"/>
             </w:rPr>
           </w:pPr>
-          <w:hyperlink w:anchor="_Toc234569439" w:history="1">
+          <w:hyperlink w:anchor="_Toc234570440" w:history="1">
             <w:r>
               <w:rPr>
                 <w:rStyle w:val="Hyperlink"/>
@@ -518,7 +518,7 @@
                 <w:noProof/>
                 <w:webHidden/>
               </w:rPr>
-              <w:instrText xml:space="preserve"> PAGEREF _Toc234569439 \h </w:instrText>
+              <w:instrText xml:space="preserve"> PAGEREF _Toc234570440 \h </w:instrText>
             </w:r>
             <w:r>
               <w:rPr>
@@ -562,7 +562,7 @@
               <w:szCs w:val="21"/>
             </w:rPr>
           </w:pPr>
-          <w:hyperlink w:anchor="_Toc234569440" w:history="1">
+          <w:hyperlink w:anchor="_Toc234570441" w:history="1">
             <w:r>
               <w:rPr>
                 <w:rStyle w:val="Hyperlink"/>
@@ -604,7 +604,7 @@
                 <w:noProof/>
                 <w:webHidden/>
               </w:rPr>
-              <w:instrText xml:space="preserve"> PAGEREF _Toc234569440 \h </w:instrText>
+              <w:instrText xml:space="preserve"> PAGEREF _Toc234570441 \h </w:instrText>
             </w:r>
             <w:r>
               <w:rPr>
@@ -648,7 +648,7 @@
               <w:szCs w:val="21"/>
             </w:rPr>
           </w:pPr>
-          <w:hyperlink w:anchor="_Toc234569441" w:history="1">
+          <w:hyperlink w:anchor="_Toc234570442" w:history="1">
             <w:r>
               <w:rPr>
                 <w:rStyle w:val="Hyperlink"/>
@@ -690,7 +690,7 @@
                 <w:noProof/>
                 <w:webHidden/>
               </w:rPr>
-              <w:instrText xml:space="preserve"> PAGEREF _Toc234569441 \h </w:instrText>
+              <w:instrText xml:space="preserve"> PAGEREF _Toc234570442 \h </w:instrText>
             </w:r>
             <w:r>
               <w:rPr>
@@ -734,7 +734,7 @@
               <w:szCs w:val="21"/>
             </w:rPr>
           </w:pPr>
-          <w:hyperlink w:anchor="_Toc234569442" w:history="1">
+          <w:hyperlink w:anchor="_Toc234570443" w:history="1">
             <w:r>
               <w:rPr>
                 <w:rStyle w:val="Hyperlink"/>
@@ -776,7 +776,7 @@
                 <w:noProof/>
                 <w:webHidden/>
               </w:rPr>
-              <w:instrText xml:space="preserve"> PAGEREF _Toc234569442 \h </w:instrText>
+              <w:instrText xml:space="preserve"> PAGEREF _Toc234570443 \h </w:instrText>
             </w:r>
             <w:r>
               <w:rPr>
@@ -796,7 +796,7 @@
                 <w:noProof/>
                 <w:webHidden/>
               </w:rPr>
-              <w:t>9</w:t>
+              <w:t>10</w:t>
             </w:r>
             <w:r>
               <w:rPr>
@@ -820,7 +820,7 @@
               <w:szCs w:val="21"/>
             </w:rPr>
           </w:pPr>
-          <w:hyperlink w:anchor="_Toc234569443" w:history="1">
+          <w:hyperlink w:anchor="_Toc234570444" w:history="1">
             <w:r>
               <w:rPr>
                 <w:rStyle w:val="Hyperlink"/>
@@ -862,7 +862,7 @@
                 <w:noProof/>
                 <w:webHidden/>
               </w:rPr>
-              <w:instrText xml:space="preserve"> PAGEREF _Toc234569443 \h </w:instrText>
+              <w:instrText xml:space="preserve"> PAGEREF _Toc234570444 \h </w:instrText>
             </w:r>
             <w:r>
               <w:rPr>
@@ -882,7 +882,7 @@
                 <w:noProof/>
                 <w:webHidden/>
               </w:rPr>
-              <w:t>9</w:t>
+              <w:t>11</w:t>
             </w:r>
             <w:r>
               <w:rPr>
@@ -906,7 +906,7 @@
               <w:szCs w:val="21"/>
             </w:rPr>
           </w:pPr>
-          <w:hyperlink w:anchor="_Toc234569444" w:history="1">
+          <w:hyperlink w:anchor="_Toc234570445" w:history="1">
             <w:r>
               <w:rPr>
                 <w:rStyle w:val="Hyperlink"/>
@@ -948,7 +948,7 @@
                 <w:noProof/>
                 <w:webHidden/>
               </w:rPr>
-              <w:instrText xml:space="preserve"> PAGEREF _Toc234569444 \h </w:instrText>
+              <w:instrText xml:space="preserve"> PAGEREF _Toc234570445 \h </w:instrText>
             </w:r>
             <w:r>
               <w:rPr>
@@ -968,7 +968,7 @@
                 <w:noProof/>
                 <w:webHidden/>
               </w:rPr>
-              <w:t>11</w:t>
+              <w:t>13</w:t>
             </w:r>
             <w:r>
               <w:rPr>
@@ -992,7 +992,7 @@
               <w:szCs w:val="21"/>
             </w:rPr>
           </w:pPr>
-          <w:hyperlink w:anchor="_Toc234569445" w:history="1">
+          <w:hyperlink w:anchor="_Toc234570446" w:history="1">
             <w:r>
               <w:rPr>
                 <w:rStyle w:val="Hyperlink"/>
@@ -1034,7 +1034,7 @@
                 <w:noProof/>
                 <w:webHidden/>
               </w:rPr>
-              <w:instrText xml:space="preserve"> PAGEREF _Toc234569445 \h </w:instrText>
+              <w:instrText xml:space="preserve"> PAGEREF _Toc234570446 \h </w:instrText>
             </w:r>
             <w:r>
               <w:rPr>
@@ -1054,7 +1054,7 @@
                 <w:noProof/>
                 <w:webHidden/>
               </w:rPr>
-              <w:t>15</w:t>
+              <w:t>16</w:t>
             </w:r>
             <w:r>
               <w:rPr>
@@ -1078,13 +1078,13 @@
               <w:szCs w:val="21"/>
             </w:rPr>
           </w:pPr>
-          <w:hyperlink w:anchor="_Toc234569446" w:history="1">
+          <w:hyperlink w:anchor="_Toc234570447" w:history="1">
             <w:r>
               <w:rPr>
                 <w:rStyle w:val="Hyperlink"/>
                 <w:noProof/>
               </w:rPr>
-              <w:t>3.2</w:t>
+              <w:t>2.8</w:t>
             </w:r>
             <w:r>
               <w:rPr>
@@ -1120,7 +1120,7 @@
                 <w:noProof/>
                 <w:webHidden/>
               </w:rPr>
-              <w:instrText xml:space="preserve"> PAGEREF _Toc234569446 \h </w:instrText>
+              <w:instrText xml:space="preserve"> PAGEREF _Toc234570447 \h </w:instrText>
             </w:r>
             <w:r>
               <w:rPr>
@@ -1140,7 +1140,7 @@
                 <w:noProof/>
                 <w:webHidden/>
               </w:rPr>
-              <w:t>21</w:t>
+              <w:t>23</w:t>
             </w:r>
             <w:r>
               <w:rPr>
@@ -1164,7 +1164,7 @@
               <w:szCs w:val="21"/>
             </w:rPr>
           </w:pPr>
-          <w:hyperlink w:anchor="_Toc234569447" w:history="1">
+          <w:hyperlink w:anchor="_Toc234570448" w:history="1">
             <w:r>
               <w:rPr>
                 <w:rStyle w:val="Hyperlink"/>
@@ -1206,7 +1206,7 @@
                 <w:noProof/>
                 <w:webHidden/>
               </w:rPr>
-              <w:instrText xml:space="preserve"> PAGEREF _Toc234569447 \h </w:instrText>
+              <w:instrText xml:space="preserve"> PAGEREF _Toc234570448 \h </w:instrText>
             </w:r>
             <w:r>
               <w:rPr>
@@ -1226,7 +1226,7 @@
                 <w:noProof/>
                 <w:webHidden/>
               </w:rPr>
-              <w:t>26</w:t>
+              <w:t>27</w:t>
             </w:r>
             <w:r>
               <w:rPr>
@@ -1249,7 +1249,7 @@
               <w:szCs w:val="21"/>
             </w:rPr>
           </w:pPr>
-          <w:hyperlink w:anchor="_Toc234569448" w:history="1">
+          <w:hyperlink w:anchor="_Toc234570449" w:history="1">
             <w:r>
               <w:rPr>
                 <w:rStyle w:val="Hyperlink"/>
@@ -1276,7 +1276,7 @@
                 <w:noProof/>
                 <w:webHidden/>
               </w:rPr>
-              <w:instrText xml:space="preserve"> PAGEREF _Toc234569448 \h </w:instrText>
+              <w:instrText xml:space="preserve"> PAGEREF _Toc234570449 \h </w:instrText>
             </w:r>
             <w:r>
               <w:rPr>
@@ -1296,7 +1296,7 @@
                 <w:noProof/>
                 <w:webHidden/>
               </w:rPr>
-              <w:t>27</w:t>
+              <w:t>28</w:t>
             </w:r>
             <w:r>
               <w:rPr>
@@ -1348,7 +1348,7 @@
         </w:numPr>
         <w:spacing w:line="360" w:lineRule="auto"/>
       </w:pPr>
-      <w:bookmarkStart w:id="0" w:name="_Toc234569434"/>
+      <w:bookmarkStart w:id="0" w:name="_Toc234570435"/>
       <w:r>
         <w:lastRenderedPageBreak/>
         <w:t>Initiating Tasks</w:t>
@@ -1364,7 +1364,7 @@
         </w:numPr>
         <w:spacing w:line="360" w:lineRule="auto"/>
       </w:pPr>
-      <w:bookmarkStart w:id="1" w:name="_Toc234569435"/>
+      <w:bookmarkStart w:id="1" w:name="_Toc234570436"/>
       <w:r>
         <w:t>Business Case</w:t>
       </w:r>
@@ -2138,7 +2138,7 @@
         </w:numPr>
         <w:spacing w:line="360" w:lineRule="auto"/>
       </w:pPr>
-      <w:bookmarkStart w:id="2" w:name="_Toc234569436"/>
+      <w:bookmarkStart w:id="2" w:name="_Toc234570437"/>
       <w:r>
         <w:t>Three Sphere’s Model</w:t>
       </w:r>
@@ -2161,7 +2161,7 @@
         </w:numPr>
         <w:spacing w:line="360" w:lineRule="auto"/>
       </w:pPr>
-      <w:bookmarkStart w:id="3" w:name="_Toc234569437"/>
+      <w:bookmarkStart w:id="3" w:name="_Toc234570438"/>
       <w:r>
         <w:lastRenderedPageBreak/>
         <w:t>Project Charter</w:t>
@@ -3435,7 +3435,7 @@
         </w:numPr>
         <w:spacing w:line="360" w:lineRule="auto"/>
       </w:pPr>
-      <w:bookmarkStart w:id="4" w:name="_Toc234569438"/>
+      <w:bookmarkStart w:id="4" w:name="_Toc234570439"/>
       <w:r>
         <w:lastRenderedPageBreak/>
         <w:t>Planning Tasks</w:t>
@@ -3450,7 +3450,7 @@
           <w:numId w:val="1"/>
         </w:numPr>
       </w:pPr>
-      <w:bookmarkStart w:id="5" w:name="_Toc234569439"/>
+      <w:bookmarkStart w:id="5" w:name="_Toc234570440"/>
       <w:r>
         <w:t>Scope Statement</w:t>
       </w:r>
@@ -3793,7 +3793,7 @@
         </w:numPr>
         <w:spacing w:line="360" w:lineRule="auto"/>
       </w:pPr>
-      <w:bookmarkStart w:id="6" w:name="_Toc234569440"/>
+      <w:bookmarkStart w:id="6" w:name="_Toc234570441"/>
       <w:r>
         <w:lastRenderedPageBreak/>
         <w:t>WBS</w:t>
@@ -3809,7 +3809,7 @@
         </w:numPr>
         <w:spacing w:line="360" w:lineRule="auto"/>
       </w:pPr>
-      <w:bookmarkStart w:id="7" w:name="_Toc234569441"/>
+      <w:bookmarkStart w:id="7" w:name="_Toc234570442"/>
       <w:r>
         <w:t>Work Item List</w:t>
       </w:r>
@@ -3829,7 +3829,7 @@
         </w:numPr>
         <w:spacing w:line="360" w:lineRule="auto"/>
       </w:pPr>
-      <w:bookmarkStart w:id="8" w:name="_Toc234569442"/>
+      <w:bookmarkStart w:id="8" w:name="_Toc234570443"/>
       <w:r>
         <w:lastRenderedPageBreak/>
         <w:t>Cost Estimate</w:t>
@@ -4720,7 +4720,7 @@
           <w:numId w:val="16"/>
         </w:numPr>
       </w:pPr>
-      <w:bookmarkStart w:id="9" w:name="_Toc234569443"/>
+      <w:bookmarkStart w:id="9" w:name="_Toc234570444"/>
       <w:r>
         <w:t>Communication Management Plan</w:t>
       </w:r>
@@ -5283,7 +5283,7 @@
           <w:numId w:val="16"/>
         </w:numPr>
       </w:pPr>
-      <w:bookmarkStart w:id="10" w:name="_Toc234569444"/>
+      <w:bookmarkStart w:id="10" w:name="_Toc234570445"/>
       <w:r>
         <w:lastRenderedPageBreak/>
         <w:t>Quality Management Plan</w:t>
@@ -6387,7 +6387,7 @@
           <w:numId w:val="16"/>
         </w:numPr>
       </w:pPr>
-      <w:bookmarkStart w:id="11" w:name="_Toc234569445"/>
+      <w:bookmarkStart w:id="11" w:name="_Toc234570446"/>
       <w:r>
         <w:t>Risk Management Plan</w:t>
       </w:r>
@@ -6410,13 +6410,7 @@
         <w:rPr>
           <w:rFonts w:cs="Times New Roman"/>
         </w:rPr>
-        <w:t>1</w:t>
-      </w:r>
-      <w:r>
-        <w:rPr>
-          <w:rFonts w:cs="Times New Roman"/>
-        </w:rPr>
-        <w:t xml:space="preserve">. </w:t>
+        <w:t xml:space="preserve">1. </w:t>
       </w:r>
       <w:r>
         <w:rPr>
@@ -9428,7 +9422,7 @@
           <w:numId w:val="16"/>
         </w:numPr>
       </w:pPr>
-      <w:bookmarkStart w:id="12" w:name="_Toc234569446"/>
+      <w:bookmarkStart w:id="12" w:name="_Toc234570447"/>
       <w:r>
         <w:t>Stakeholder Management Plan</w:t>
       </w:r>
@@ -9837,6 +9831,7 @@
               <w:rPr>
                 <w:rFonts w:cs="Times New Roman"/>
               </w:rPr>
+              <w:lastRenderedPageBreak/>
               <w:t xml:space="preserve">UAT Participants (5+ </w:t>
             </w:r>
             <w:proofErr w:type="gramStart"/>
@@ -10279,7 +10274,7 @@
           <w:numId w:val="1"/>
         </w:numPr>
       </w:pPr>
-      <w:bookmarkStart w:id="13" w:name="_Toc234569447"/>
+      <w:bookmarkStart w:id="13" w:name="_Toc234570448"/>
       <w:r>
         <w:lastRenderedPageBreak/>
         <w:t>Conclusion</w:t>
@@ -10316,7 +10311,6 @@
       </w:pPr>
     </w:p>
     <w:p>
-      <w:bookmarkStart w:id="14" w:name="_Toc234569448"/>
       <w:r>
         <w:br w:type="page"/>
       </w:r>
@@ -10325,6 +10319,7 @@
       <w:pPr>
         <w:pStyle w:val="Heading1"/>
       </w:pPr>
+      <w:bookmarkStart w:id="14" w:name="_Toc234570449"/>
       <w:r>
         <w:lastRenderedPageBreak/>
         <w:t>References</w:t>
@@ -13891,6 +13886,7 @@
   <w:style w:type="character" w:default="1" w:styleId="DefaultParagraphFont">
     <w:name w:val="Default Paragraph Font"/>
     <w:uiPriority w:val="1"/>
+    <w:semiHidden/>
     <w:unhideWhenUsed/>
   </w:style>
   <w:style w:type="table" w:default="1" w:styleId="TableNormal">

</xml_diff>